<commit_message>
Add optional EEVDF latency tuning evidence
</commit_message>
<xml_diff>
--- a/docs/competition/materials/开发设计文档.docx
+++ b/docs/competition/materials/开发设计文档.docx
@@ -919,6 +919,14 @@
       </w:pPr>
       <w:r>
         <w:t>3.3  参考</w:t>
+      </w:r>
+    </w:p>
+    <w:p>
+      <w:pPr>
+        <w:pStyle w:val="00002a"/>
+      </w:pPr>
+      <w:r>
+        <w:t>3.4  可选调优实验</w:t>
       </w:r>
     </w:p>
     <w:p>
@@ -2586,10 +2594,7 @@
         <w:wordWrap w:val="true"/>
       </w:pPr>
       <w:r>
-        <w:rPr>
-          <w:lang w:val="en-US" w:eastAsia="zh-CN"/>
-        </w:rPr>
-        <w:t>下一步优先将后台 slice 缩短与开启 HRTICK 分别作为独立变量重测，再评估新版本 DELAY_DEQUEUE 等机制的回移成本。以上属于未来工作，本版未实现。后续验收应增加用户态 QoS 接口测试、SMP 迁移、长稳压力和实机应用工作负载。</w:t>
+        <w:t>补充实验已比较后台 slice 和 HRTICK，结果与代价见第 3.4 节。新版本 DELAY_DEQUEUE 等机制尚未回移。后续验收应增加用户态 QoS 接口测试、SMP 迁移、长稳压力和实机应用工作负载。</w:t>
       </w:r>
     </w:p>
     <w:p>
@@ -2599,10 +2604,7 @@
         <w:wordWrap w:val="true"/>
       </w:pPr>
       <w:r>
-        <w:rPr>
-          <w:lang w:val="en-US" w:eastAsia="zh-CN"/>
-        </w:rPr>
-        <w:t>有限 QEMU 测试通过不等于生产稳定。SMP 迁移、长稳压力、实机和完整用户态 QoS 链路仍未验收。后续将分别控制后台 slice 和 HRTICK 变量，避免把多项改动的效果混为因果。</w:t>
+        <w:t>有限 QEMU 测试通过不等于生产稳定。SMP 迁移、长稳压力、实机和完整用户态 QoS 链路仍未验收。补充实验控制请求上限与 HRTICK 变量，完整结果见第 3.4 节。</w:t>
       </w:r>
     </w:p>
     <w:p>
@@ -2664,6 +2666,71 @@
           <w:lang w:val="en-US" w:eastAsia="zh-CN"/>
         </w:rPr>
         <w:t>源码见 repo；本次证据见 docs/competition/evidence；历史证据见内核分析/09-QEMU对照结果.md 和 10-CFS与EEVDF对比结果.md；详细命令见《复现指南》，完整统计见《实验结果》。</w:t>
+      </w:r>
+    </w:p>
+    <w:p>
+      <w:pPr>
+        <w:pStyle w:val="000004"/>
+        <w:keepNext/>
+        <w:pageBreakBefore/>
+        <w:widowControl w:val="false"/>
+        <w:tabs>
+          <w:tab w:val="left" w:pos="720"/>
+        </w:tabs>
+        <w:spacing w:before="0" w:after="120"/>
+        <w:ind w:left="720" w:hanging="567"/>
+        <w:jc w:val="left"/>
+        <w:rPr>
+          <w:rFonts w:ascii="SimSun" w:hAnsi="SimSun" w:eastAsia="SimSun"/>
+        </w:rPr>
+      </w:pPr>
+      <w:r>
+        <w:t>可选调优实验</w:t>
+      </w:r>
+    </w:p>
+    <w:p>
+      <w:pPr>
+        <w:pStyle w:val="00000b"/>
+        <w:widowControl/>
+      </w:pPr>
+      <w:r>
+        <w:t>2026 年 10 月 30 日补充实验将 QoS 请求上限设为 4 ms，并启用 HRTICK。三轮基线与调优交替启动中，四忙等任务加 QoS 的唤醒 p99 中位数由 15.576 ms 降至 9.474 ms，降低 39.2%。每次每场景 300 样本，未合并计算分位数。</w:t>
+      </w:r>
+    </w:p>
+    <w:p>
+      <w:pPr>
+        <w:pStyle w:val="00000b"/>
+        <w:widowControl/>
+      </w:pPr>
+      <w:r>
+        <w:t>代价是 pingpong 整轮交接耗时由 12.478 μs 增至 23.323 μs，增加 86.9%；无 QoS 的四忙等任务 p99 从 8.061 ms 增至 9.563 ms。结果仍高于另一批初版 CFS 实验的 1.044 ms，不能宣称整体或实机性能改善。</w:t>
+      </w:r>
+    </w:p>
+    <w:p>
+      <w:pPr>
+        <w:pStyle w:val="00000b"/>
+        <w:widowControl/>
+      </w:pPr>
+      <w:r>
+        <w:t>三次独立 QoS 启动均通过原阈值以及 fork、reweight、AVG done 检查；三项不变量不一致及 reweight 越界均为 0。QoS pick 比为 2.06、2.07、2.07，接近阈值 2。2 ms 加 HRTICK 的 pick 比仅 1.35，判为 inconclusive，未选用且保留失败证据。</w:t>
+      </w:r>
+    </w:p>
+    <w:p>
+      <w:pPr>
+        <w:pStyle w:val="00000b"/>
+        <w:widowControl/>
+      </w:pPr>
+      <w:r>
+        <w:t>补充实验包含两个隔离增量内核 Image 构建和 17 组启动日志，覆盖六种单次筛选、六次交替比较、四次 QoS 检查及一次正常启动。没有执行完整操作系统的干净重建；性能数据均来自 QEMU TCG 客户机时钟。</w:t>
+      </w:r>
+    </w:p>
+    <w:p>
+      <w:pPr>
+        <w:pStyle w:val="00000b"/>
+        <w:widowControl/>
+      </w:pPr>
+      <w:r>
+        <w:t>可选补丁保持原源码快照不变。cap 参数默认 0 保留请求映射；非零 1000 至 14000 μs 仅限制有效 QoS 等级。包含 HRTICK 补丁的镜像在 cap=0 时仍开启高精度定时器；完整恢复原策略须使用 cap-only 镜像并设为 0。应用方式、全部场景和取舍见《调优实验》及《复现指南》，哈希和构建日志见 evidence/latency-2026-10-30。</w:t>
       </w:r>
     </w:p>
     <w:sectPr>

</xml_diff>